<commit_message>
docs: update IEEE project reports and refined benchmark figures
</commit_message>
<xml_diff>
--- a/IEEE_Report_PCAP_CUDA_Acceleration.docx
+++ b/IEEE_Report_PCAP_CUDA_Acceleration.docx
@@ -423,7 +423,7 @@
       <w:r>
         <w:drawing>
           <wp:inline xmlns:a="http://schemas.openxmlformats.org/drawingml/2006/main" xmlns:pic="http://schemas.openxmlformats.org/drawingml/2006/picture">
-            <wp:extent cx="3017520" cy="2587487"/>
+            <wp:extent cx="3017520" cy="2613825"/>
             <wp:docPr id="1" name="Picture 1"/>
             <wp:cNvGraphicFramePr>
               <a:graphicFrameLocks noChangeAspect="1"/>
@@ -444,7 +444,7 @@
                   <pic:spPr>
                     <a:xfrm>
                       <a:off x="0" y="0"/>
-                      <a:ext cx="3017520" cy="2587487"/>
+                      <a:ext cx="3017520" cy="2613825"/>
                     </a:xfrm>
                     <a:prstGeom prst="rect"/>
                   </pic:spPr>

</xml_diff>